<commit_message>
Harden final defense with full Prolog-Racket comparative framing.
Expands the functional implementation to mirror core Prolog queries, adds a formal comparison document, updates defense/checklist docs, and regenerates the final report with explicit two-paradigm justification.

Co-authored-by: Cursor <cursoragent@cursor.com>
</commit_message>
<xml_diff>
--- a/Trabajo_Final_Prolog.docx
+++ b/Trabajo_Final_Prolog.docx
@@ -96,7 +96,7 @@
         <w:jc w:val="center"/>
       </w:pPr>
       <w:r>
-        <w:t>Fecha: 07/03/2026</w:t>
+        <w:t>Fecha: 05/08/2026</w:t>
       </w:r>
     </w:p>
     <w:p>
@@ -141,7 +141,7 @@
         <w:jc w:val="both"/>
       </w:pPr>
       <w:r>
-        <w:t>Este trabajo presenta el diseño e implementación de un sistema experto en Prolog para apoyar decisiones de fichajes en fútbol profesional. El modelo representa jugadores, equipos y reglas de negocio mediante hechos y predicados, incorporando restricciones de presupuesto, edad, cupos de extranjeros, necesidades por posición y reglas de liga. Además, se integra un componente de química entre jugadores para mejorar la evaluación de combinaciones de fichaje. La propuesta incluye una interfaz visual que permite consultar resultados, explorar plantillas y comparar candidatos de manera intuitiva. Como aporte práctico, se automatiza la adquisición de datos visuales (logos y fotos) y se agregan mecanismos de robustez frente a errores de red y desalineación de datos. Los resultados muestran que el enfoque declarativo facilita expresar criterios complejos con alta trazabilidad y buena mantenibilidad. En síntesis, el proyecto demuestra la aplicabilidad de la programación lógica para problemas reales de optimización combinatoria y apoyo a decisiones, articulando fundamentos teóricos del paradigma con una implementación usable para demostración académica y potencial extensión profesional [1], [2], [4].</w:t>
+        <w:t>Este trabajo presenta el diseño e implementación de un sistema experto en Prolog para apoyar decisiones de fichajes en fútbol profesional. El modelo representa jugadores, equipos y reglas de negocio mediante hechos y predicados, incorporando restricciones de presupuesto, edad, cupos de extranjeros, necesidades por posición y reglas de liga. Además, se integra un componente de química entre jugadores para mejorar la evaluación de combinaciones de fichaje. La propuesta incluye una interfaz visual que permite consultar resultados, explorar plantillas y comparar candidatos de manera intuitiva. Como aporte práctico, se automatiza la adquisición de datos visuales (logos y fotos) y se agregan mecanismos de robustez frente a errores de red y desalineación de datos. Los resultados muestran que el enfoque declarativo facilita expresar criterios complejos con alta trazabilidad y buena mantenibilidad. En síntesis, el proyecto demuestra la aplicabilidad de la programación lógica para problemas reales de optimización combinatoria y apoyo a decisiones. Además, incorpora una implementación funcional comparativa en Racket/Scheme para resolver consultas equivalentes y contrastar estilos de modelado declarativo, articulando fundamentos teóricos de ambos paradigmas con una implementación usable para demostración académica [1], [2], [4], [8].</w:t>
       </w:r>
     </w:p>
     <w:p>
@@ -177,7 +177,7 @@
         <w:jc w:val="both"/>
       </w:pPr>
       <w:r>
-        <w:t>La relevancia académica del tema radica en conectar conceptos centrales de la asignatura —hechos, reglas, unificación, búsqueda, backtracking, recursión— con un dominio real y de alto interés. Desde una perspectiva aplicada, también se trabaja la ingeniería del sistema: separación modular, documentación, pruebas básicas y una interfaz de usuario que permita comunicar resultados a personas no técnicas.</w:t>
+        <w:t>La relevancia académica del tema radica en conectar conceptos centrales de la asignatura —hechos, reglas, unificación, búsqueda, backtracking, recursión y funciones de orden superior— con un dominio real y de alto interés. Desde una perspectiva aplicada, también se trabaja la ingeniería del sistema: separación modular, documentación, pruebas básicas y una interfaz de usuario que permita comunicar resultados a personas no técnicas.</w:t>
       </w:r>
     </w:p>
     <w:p>
@@ -222,6 +222,14 @@
       </w:pPr>
       <w:r>
         <w:t>Desde el punto de vista de modelado, las restricciones son predicados adicionales que acotan soluciones posibles. En problemas de selección de plantillas o fichajes, esto habilita una representación natural de cupos, límites y condiciones contextuales. Además, la recursión facilita el procesamiento de listas para cálculos agregados (coste total, rendimiento total, conteos) [3].</w:t>
+      </w:r>
+    </w:p>
+    <w:p>
+      <w:pPr>
+        <w:jc w:val="both"/>
+      </w:pPr>
+      <w:r>
+        <w:t>En paralelo, el enfoque funcional (Racket/Scheme) permite representar el mismo dominio mediante estructuras inmutables y pipelines de transformación (`map`, `filter`, `foldl`), con control explícito de la estrategia de búsqueda. Esta dualidad habilita una comparación didáctica directa entre paradigmas de la materia [8].</w:t>
       </w:r>
     </w:p>
     <w:p>
@@ -386,6 +394,70 @@
     </w:p>
     <w:p>
       <w:pPr>
+        <w:pStyle w:val="Heading2"/>
+      </w:pPr>
+      <w:r>
+        <w:rPr>
+          <w:rFonts w:ascii="Times New Roman" w:hAnsi="Times New Roman"/>
+          <w:sz w:val="24"/>
+        </w:rPr>
+        <w:t>5.6 Implementación comparativa funcional (Racket/Scheme)</w:t>
+      </w:r>
+    </w:p>
+    <w:p>
+      <w:pPr>
+        <w:jc w:val="both"/>
+      </w:pPr>
+      <w:r>
+        <w:t>Para cubrir explícitamente el componente funcional de la asignatura, se implementó un módulo en Racket que resuelve consultas equivalentes al modelo Prolog: viabilidad de fichaje, recomendaciones, mejor fichaje y combinación óptima acotada. El modelo funcional utiliza datos inmutables (`struct`), funciones puras y funciones de orden superior.</w:t>
+      </w:r>
+    </w:p>
+    <w:p>
+      <w:pPr>
+        <w:jc w:val="both"/>
+      </w:pPr>
+      <w:r>
+        <w:t>A diferencia de Prolog, donde la búsqueda y el backtracking son responsabilidad del motor de inferencia, en Racket la estrategia es explícita: generación recursiva de subconjuntos, filtros de validez y selección por criterio de rendimiento. Esto permite comparar no solo rendimiento, sino también claridad semántica, esfuerzo de implementación y control algorítmico.</w:t>
+      </w:r>
+    </w:p>
+    <w:p>
+      <w:pPr>
+        <w:jc w:val="both"/>
+      </w:pPr>
+      <w:r>
+        <w:t>Como evidencia de calidad, el módulo funcional incorpora pruebas con `rackunit` y una demo de consola orientada a exposición académica. De este modo, el trabajo deja de ser exclusivamente lógico y pasa a ser efectivamente comparativo entre paradigmas declarativos.</w:t>
+      </w:r>
+    </w:p>
+    <w:p>
+      <w:pPr>
+        <w:pStyle w:val="Heading2"/>
+      </w:pPr>
+      <w:r>
+        <w:rPr>
+          <w:rFonts w:ascii="Times New Roman" w:hAnsi="Times New Roman"/>
+          <w:sz w:val="24"/>
+        </w:rPr>
+        <w:t>5.7 Síntesis comparativa entre paradigmas</w:t>
+      </w:r>
+    </w:p>
+    <w:p>
+      <w:pPr>
+        <w:jc w:val="both"/>
+      </w:pPr>
+      <w:r>
+        <w:t>En Prolog, la principal ventaja observada es la concisión para expresar restricciones y relaciones: la pregunta de negocio se traduce en predicados y el motor explora soluciones. En Racket/Scheme, la ventaja está en el control explícito de transformaciones y composición funcional, favoreciendo modularidad y trazabilidad del flujo de datos.</w:t>
+      </w:r>
+    </w:p>
+    <w:p>
+      <w:pPr>
+        <w:jc w:val="both"/>
+      </w:pPr>
+      <w:r>
+        <w:t>La comparación permite concluir que ambos enfoques son válidos para el problema, pero optimizan objetivos distintos: Prolog reduce complejidad expresiva en búsqueda relacional; Racket/Scheme aumenta control algorítmico en pipelines determinísticos. Esta complementariedad refleja con fidelidad los objetivos formativos de Programación Lógica y Funcional.</w:t>
+      </w:r>
+    </w:p>
+    <w:p>
+      <w:pPr>
         <w:pStyle w:val="Heading1"/>
       </w:pPr>
       <w:r>
@@ -501,7 +573,7 @@
         <w:jc w:val="both"/>
       </w:pPr>
       <w:r>
-        <w:t>[8] M. Wooldridge, An Introduction to MultiAgent Systems, 2nd ed. Chichester, UK: Wiley, 2009.</w:t>
+        <w:t>[8] Racket Documentation, "The Racket Guide," 2026. [Online]. Available: https://docs.racket-lang.org/guide/</w:t>
       </w:r>
     </w:p>
     <w:p>
@@ -509,7 +581,7 @@
         <w:jc w:val="both"/>
       </w:pPr>
       <w:r>
-        <w:t>[9] S. Russell and P. Norvig, Artificial Intelligence: A Modern Approach, 4th ed. Hoboken, NJ, USA: Pearson, 2021.</w:t>
+        <w:t>[9] M. Wooldridge, An Introduction to MultiAgent Systems, 2nd ed. Chichester, UK: Wiley, 2009.</w:t>
       </w:r>
     </w:p>
     <w:p>
@@ -517,7 +589,15 @@
         <w:jc w:val="both"/>
       </w:pPr>
       <w:r>
-        <w:t>[10] FIFA, "Regulations on the Status and Transfer of Players," 2026. [Online]. Available: https://www.fifa.com/legal</w:t>
+        <w:t>[10] S. Russell and P. Norvig, Artificial Intelligence: A Modern Approach, 4th ed. Hoboken, NJ, USA: Pearson, 2021.</w:t>
+      </w:r>
+    </w:p>
+    <w:p>
+      <w:pPr>
+        <w:jc w:val="both"/>
+      </w:pPr>
+      <w:r>
+        <w:t>[11] FIFA, "Regulations on the Status and Transfer of Players," 2026. [Online]. Available: https://www.fifa.com/legal</w:t>
       </w:r>
     </w:p>
     <w:sectPr>

</xml_diff>